<commit_message>
feat(shop): complete accountant handoff report
</commit_message>
<xml_diff>
--- a/docs/School Shop User Guide.docx
+++ b/docs/School Shop User Guide.docx
@@ -4019,6 +4019,17 @@
         <w:rPr>
           <w:b w:val="0"/>
         </w:rPr>
+        <w:t>inventory adjustments, quantity changes, approval status, and value changes at unit cost;</w:t>
+      </w:r>
+    </w:p>
+    <w:p>
+      <w:pPr>
+        <w:pStyle w:val="ListBullet"/>
+      </w:pPr>
+      <w:r>
+        <w:rPr>
+          <w:b w:val="0"/>
+        </w:rPr>
         <w:t>stock held by staff;</w:t>
       </w:r>
     </w:p>
@@ -4071,7 +4082,27 @@
         <w:rPr>
           <w:b w:val="0"/>
         </w:rPr>
-        <w:t>For accounting, export a closed period and provide it with source documents such as supplier invoices, Mobile Money statements, deposit slips, and refund evidence. The accountant can use the records to prepare journals, cost of sales, inventory values, cash controls, management accounts, and final accounts. The report is source information; formal ledger posting remains an accounting responsibility.</w:t>
+        <w:t xml:space="preserve">The </w:t>
+      </w:r>
+      <w:r>
+        <w:rPr>
+          <w:b/>
+        </w:rPr>
+        <w:t>Accounting CSV</w:t>
+      </w:r>
+      <w:r>
+        <w:rPr>
+          <w:b w:val="0"/>
+        </w:rPr>
+        <w:t xml:space="preserve"> gives the accountant one dated, reference-based file containing sales, refunds, cost of sales, gross profit, reconciliation differences, approved inventory adjustments, cash remittances, and the closing cash-responsibility snapshot. A remittance is identified as an internal transfer so it is not counted again as income.</w:t>
+      </w:r>
+    </w:p>
+    <w:p>
+      <w:r>
+        <w:rPr>
+          <w:b w:val="0"/>
+        </w:rPr>
+        <w:t>For accounting, export a closed period and provide the CSV and PDF with source documents such as supplier invoices, Mobile Money statements, deposit slips, and refund evidence. The accountant can use the records to prepare journals, cost of sales, inventory values, cash controls, management accounts, and final accounts. The report is source information; formal ledger posting remains an accounting responsibility.</w:t>
       </w:r>
     </w:p>
     <w:p>

</xml_diff>